<commit_message>
Update legal declaration documents
</commit_message>
<xml_diff>
--- a/mccl-tests-license.docx
+++ b/mccl-tests-license.docx
@@ -23,13 +23,8 @@
       <w:r>
         <w:t xml:space="preserve">This project is modified from the </w:t>
       </w:r>
-      <w:proofErr w:type="spellStart"/>
-      <w:r>
-        <w:t>nccl</w:t>
-      </w:r>
-      <w:proofErr w:type="spellEnd"/>
-      <w:r>
-        <w:t>-tests</w:t>
+      <w:r>
+        <w:t>nccl-tests</w:t>
       </w:r>
       <w:r>
         <w:t xml:space="preserve"> project (</w:t>
@@ -46,13 +41,8 @@
       <w:r>
         <w:t xml:space="preserve">license. The following is the original LICENSE from the </w:t>
       </w:r>
-      <w:proofErr w:type="spellStart"/>
-      <w:r>
-        <w:t>nccl</w:t>
-      </w:r>
-      <w:proofErr w:type="spellEnd"/>
-      <w:r>
-        <w:t>-tests</w:t>
+      <w:r>
+        <w:t>nccl-tests</w:t>
       </w:r>
       <w:r>
         <w:t xml:space="preserve"> project.</w:t>
@@ -63,22 +53,18 @@
       <w:r>
         <w:t xml:space="preserve">Redistribution and use in source and binary forms, with or </w:t>
       </w:r>
-      <w:proofErr w:type="spellStart"/>
       <w:proofErr w:type="gramStart"/>
       <w:r>
         <w:t>withoutmodification</w:t>
       </w:r>
-      <w:proofErr w:type="spellEnd"/>
       <w:proofErr w:type="gramEnd"/>
       <w:r>
         <w:t xml:space="preserve">, are permitted provided that the following </w:t>
       </w:r>
-      <w:proofErr w:type="spellStart"/>
       <w:proofErr w:type="gramStart"/>
       <w:r>
         <w:t>conditionsare</w:t>
       </w:r>
-      <w:proofErr w:type="spellEnd"/>
       <w:proofErr w:type="gramEnd"/>
       <w:r>
         <w:t xml:space="preserve"> met:</w:t>
@@ -124,7 +110,19 @@
     </w:p>
     <w:p>
       <w:r>
-        <w:t>* Neither the name of NVIDIA CORPORATION, nor the names of their</w:t>
+        <w:t xml:space="preserve">* Neither the name of NVIDIA CORPORATION, </w:t>
+      </w:r>
+      <w:r>
+        <w:t>MetaX Integrated Circuits (Shanghai) Co.</w:t>
+      </w:r>
+      <w:r>
+        <w:rPr>
+          <w:rFonts w:hint="eastAsia"/>
+        </w:rPr>
+        <w:t xml:space="preserve">, </w:t>
+      </w:r>
+      <w:r>
+        <w:t>nor the names of their</w:t>
       </w:r>
       <w:r>
         <w:rPr>
@@ -259,6 +257,56 @@
     </w:sectPr>
   </w:body>
 </w:document>
+</file>
+
+<file path=word/endnotes.xml><?xml version="1.0" encoding="utf-8"?>
+<w:endnotes xmlns:wpc="http://schemas.microsoft.com/office/word/2010/wordprocessingCanvas" xmlns:cx="http://schemas.microsoft.com/office/drawing/2014/chartex" xmlns:cx1="http://schemas.microsoft.com/office/drawing/2015/9/8/chartex" xmlns:cx2="http://schemas.microsoft.com/office/drawing/2015/10/21/chartex" xmlns:cx3="http://schemas.microsoft.com/office/drawing/2016/5/9/chartex" xmlns:cx4="http://schemas.microsoft.com/office/drawing/2016/5/10/chartex" xmlns:cx5="http://schemas.microsoft.com/office/drawing/2016/5/11/chartex" xmlns:cx6="http://schemas.microsoft.com/office/drawing/2016/5/12/chartex" xmlns:cx7="http://schemas.microsoft.com/office/drawing/2016/5/13/chartex" xmlns:cx8="http://schemas.microsoft.com/office/drawing/2016/5/14/chartex" xmlns:mc="http://schemas.openxmlformats.org/markup-compatibility/2006" xmlns:aink="http://schemas.microsoft.com/office/drawing/2016/ink" xmlns:am3d="http://schemas.microsoft.com/office/drawing/2017/model3d" xmlns:o="urn:schemas-microsoft-com:office:office" xmlns:oel="http://schemas.microsoft.com/office/2019/extlst" xmlns:r="http://schemas.openxmlformats.org/officeDocument/2006/relationships" xmlns:m="http://schemas.openxmlformats.org/officeDocument/2006/math" xmlns:v="urn:schemas-microsoft-com:vml" xmlns:wp14="http://schemas.microsoft.com/office/word/2010/wordprocessingDrawing" xmlns:wp="http://schemas.openxmlformats.org/drawingml/2006/wordprocessingDrawing" xmlns:w10="urn:schemas-microsoft-com:office:word" xmlns:w="http://schemas.openxmlformats.org/wordprocessingml/2006/main" xmlns:w14="http://schemas.microsoft.com/office/word/2010/wordml" xmlns:w15="http://schemas.microsoft.com/office/word/2012/wordml" xmlns:w16cex="http://schemas.microsoft.com/office/word/2018/wordml/cex" xmlns:w16cid="http://schemas.microsoft.com/office/word/2016/wordml/cid" xmlns:w16="http://schemas.microsoft.com/office/word/2018/wordml" xmlns:w16du="http://schemas.microsoft.com/office/word/2023/wordml/word16du" xmlns:w16sdtdh="http://schemas.microsoft.com/office/word/2020/wordml/sdtdatahash" xmlns:w16sdtfl="http://schemas.microsoft.com/office/word/2024/wordml/sdtformatlock" xmlns:w16se="http://schemas.microsoft.com/office/word/2015/wordml/symex" xmlns:wpg="http://schemas.microsoft.com/office/word/2010/wordprocessingGroup" xmlns:wpi="http://schemas.microsoft.com/office/word/2010/wordprocessingInk" xmlns:wne="http://schemas.microsoft.com/office/word/2006/wordml" xmlns:wps="http://schemas.microsoft.com/office/word/2010/wordprocessingShape" mc:Ignorable="w14 w15 w16se w16cid w16 w16cex w16sdtdh w16sdtfl w16du wp14">
+  <w:endnote w:type="separator" w:id="-1">
+    <w:p>
+      <w:pPr>
+        <w:spacing w:line="240" w:lineRule="auto"/>
+      </w:pPr>
+      <w:r>
+        <w:separator/>
+      </w:r>
+    </w:p>
+  </w:endnote>
+  <w:endnote w:type="continuationSeparator" w:id="0">
+    <w:p>
+      <w:pPr>
+        <w:spacing w:line="240" w:lineRule="auto"/>
+      </w:pPr>
+      <w:r>
+        <w:continuationSeparator/>
+      </w:r>
+    </w:p>
+  </w:endnote>
+</w:endnotes>
+</file>
+
+<file path=word/footnotes.xml><?xml version="1.0" encoding="utf-8"?>
+<w:footnotes xmlns:wpc="http://schemas.microsoft.com/office/word/2010/wordprocessingCanvas" xmlns:cx="http://schemas.microsoft.com/office/drawing/2014/chartex" xmlns:cx1="http://schemas.microsoft.com/office/drawing/2015/9/8/chartex" xmlns:cx2="http://schemas.microsoft.com/office/drawing/2015/10/21/chartex" xmlns:cx3="http://schemas.microsoft.com/office/drawing/2016/5/9/chartex" xmlns:cx4="http://schemas.microsoft.com/office/drawing/2016/5/10/chartex" xmlns:cx5="http://schemas.microsoft.com/office/drawing/2016/5/11/chartex" xmlns:cx6="http://schemas.microsoft.com/office/drawing/2016/5/12/chartex" xmlns:cx7="http://schemas.microsoft.com/office/drawing/2016/5/13/chartex" xmlns:cx8="http://schemas.microsoft.com/office/drawing/2016/5/14/chartex" xmlns:mc="http://schemas.openxmlformats.org/markup-compatibility/2006" xmlns:aink="http://schemas.microsoft.com/office/drawing/2016/ink" xmlns:am3d="http://schemas.microsoft.com/office/drawing/2017/model3d" xmlns:o="urn:schemas-microsoft-com:office:office" xmlns:oel="http://schemas.microsoft.com/office/2019/extlst" xmlns:r="http://schemas.openxmlformats.org/officeDocument/2006/relationships" xmlns:m="http://schemas.openxmlformats.org/officeDocument/2006/math" xmlns:v="urn:schemas-microsoft-com:vml" xmlns:wp14="http://schemas.microsoft.com/office/word/2010/wordprocessingDrawing" xmlns:wp="http://schemas.openxmlformats.org/drawingml/2006/wordprocessingDrawing" xmlns:w10="urn:schemas-microsoft-com:office:word" xmlns:w="http://schemas.openxmlformats.org/wordprocessingml/2006/main" xmlns:w14="http://schemas.microsoft.com/office/word/2010/wordml" xmlns:w15="http://schemas.microsoft.com/office/word/2012/wordml" xmlns:w16cex="http://schemas.microsoft.com/office/word/2018/wordml/cex" xmlns:w16cid="http://schemas.microsoft.com/office/word/2016/wordml/cid" xmlns:w16="http://schemas.microsoft.com/office/word/2018/wordml" xmlns:w16du="http://schemas.microsoft.com/office/word/2023/wordml/word16du" xmlns:w16sdtdh="http://schemas.microsoft.com/office/word/2020/wordml/sdtdatahash" xmlns:w16sdtfl="http://schemas.microsoft.com/office/word/2024/wordml/sdtformatlock" xmlns:w16se="http://schemas.microsoft.com/office/word/2015/wordml/symex" xmlns:wpg="http://schemas.microsoft.com/office/word/2010/wordprocessingGroup" xmlns:wpi="http://schemas.microsoft.com/office/word/2010/wordprocessingInk" xmlns:wne="http://schemas.microsoft.com/office/word/2006/wordml" xmlns:wps="http://schemas.microsoft.com/office/word/2010/wordprocessingShape" mc:Ignorable="w14 w15 w16se w16cid w16 w16cex w16sdtdh w16sdtfl w16du wp14">
+  <w:footnote w:type="separator" w:id="-1">
+    <w:p>
+      <w:pPr>
+        <w:spacing w:line="240" w:lineRule="auto"/>
+      </w:pPr>
+      <w:r>
+        <w:separator/>
+      </w:r>
+    </w:p>
+  </w:footnote>
+  <w:footnote w:type="continuationSeparator" w:id="0">
+    <w:p>
+      <w:pPr>
+        <w:spacing w:line="240" w:lineRule="auto"/>
+      </w:pPr>
+      <w:r>
+        <w:continuationSeparator/>
+      </w:r>
+    </w:p>
+  </w:footnote>
+</w:footnotes>
 </file>
 
 <file path=word/styles.xml><?xml version="1.0" encoding="utf-8"?>
@@ -1212,6 +1260,69 @@
       <w:shd w:val="clear" w:color="auto" w:fill="E1DFDD"/>
     </w:rPr>
   </w:style>
+  <w:style w:type="paragraph" w:styleId="af1">
+    <w:name w:val="header"/>
+    <w:basedOn w:val="a"/>
+    <w:link w:val="af2"/>
+    <w:uiPriority w:val="99"/>
+    <w:unhideWhenUsed/>
+    <w:rsid w:val="0098117D"/>
+    <w:pPr>
+      <w:tabs>
+        <w:tab w:val="center" w:pos="4153"/>
+        <w:tab w:val="right" w:pos="8306"/>
+      </w:tabs>
+      <w:snapToGrid w:val="0"/>
+      <w:spacing w:line="240" w:lineRule="auto"/>
+      <w:jc w:val="center"/>
+    </w:pPr>
+    <w:rPr>
+      <w:sz w:val="18"/>
+      <w:szCs w:val="18"/>
+    </w:rPr>
+  </w:style>
+  <w:style w:type="character" w:customStyle="1" w:styleId="af2">
+    <w:name w:val="页眉 字符"/>
+    <w:basedOn w:val="a0"/>
+    <w:link w:val="af1"/>
+    <w:uiPriority w:val="99"/>
+    <w:rsid w:val="0098117D"/>
+    <w:rPr>
+      <w:sz w:val="18"/>
+      <w:szCs w:val="18"/>
+    </w:rPr>
+  </w:style>
+  <w:style w:type="paragraph" w:styleId="af3">
+    <w:name w:val="footer"/>
+    <w:basedOn w:val="a"/>
+    <w:link w:val="af4"/>
+    <w:uiPriority w:val="99"/>
+    <w:unhideWhenUsed/>
+    <w:rsid w:val="0098117D"/>
+    <w:pPr>
+      <w:tabs>
+        <w:tab w:val="center" w:pos="4153"/>
+        <w:tab w:val="right" w:pos="8306"/>
+      </w:tabs>
+      <w:snapToGrid w:val="0"/>
+      <w:spacing w:line="240" w:lineRule="auto"/>
+    </w:pPr>
+    <w:rPr>
+      <w:sz w:val="18"/>
+      <w:szCs w:val="18"/>
+    </w:rPr>
+  </w:style>
+  <w:style w:type="character" w:customStyle="1" w:styleId="af4">
+    <w:name w:val="页脚 字符"/>
+    <w:basedOn w:val="a0"/>
+    <w:link w:val="af3"/>
+    <w:uiPriority w:val="99"/>
+    <w:rsid w:val="0098117D"/>
+    <w:rPr>
+      <w:sz w:val="18"/>
+      <w:szCs w:val="18"/>
+    </w:rPr>
+  </w:style>
 </w:styles>
 </file>
 

</xml_diff>